<commit_message>
Six document designs in both formats, and a recommendation per posting
Every CV and cover letter now downloads as .docx or PDF in any of six
designs, set in embedded Geist and gated by scripts that assert what a
parser reads out of each — in reading order for the PDFs. A rule-based
recommender picks the design per format for each posting from the ATS it
sits on, the country, the sector and the company size, and the panel's
download buttons follow it. Defaults: classic .docx for the upload,
column PDF — the dark-rail page with the photo — for a person.

Co-Authored-By: Claude Opus 5 <noreply@anthropic.com>
</commit_message>
<xml_diff>
--- a/templates/cover-letter-template.docx
+++ b/templates/cover-letter-template.docx
@@ -1,6 +1,6 @@
 
 <file path=word/document.xml><?xml version="1.0" encoding="utf-8"?>
-<w:document xmlns:w="http://schemas.openxmlformats.org/wordprocessingml/2006/main">
+<w:document xmlns:w="http://schemas.openxmlformats.org/wordprocessingml/2006/main" xmlns:w14="http://schemas.microsoft.com/office/word/2010/wordml" xmlns:mc="http://schemas.openxmlformats.org/markup-compatibility/2006" xmlns:r="http://schemas.openxmlformats.org/officeDocument/2006/relationships" xmlns:wp="http://schemas.openxmlformats.org/drawingml/2006/wordprocessingDrawing" xmlns:a="http://schemas.openxmlformats.org/drawingml/2006/main" xmlns:pic="http://schemas.openxmlformats.org/drawingml/2006/picture" mc:Ignorable="w14">
   <w:body>
     <w:p>
       <w:pPr>
@@ -9,6 +9,7 @@
       </w:pPr>
       <w:r>
         <w:rPr>
+          <w:rFonts w:ascii="Geist" w:hAnsi="Geist" w:cs="Geist"/>
           <w:b/>
           <w:sz w:val="32"/>
           <w:szCs w:val="32"/>
@@ -23,23 +24,25 @@
       </w:pPr>
       <w:r>
         <w:rPr>
+          <w:rFonts w:ascii="Geist" w:hAnsi="Geist" w:cs="Geist"/>
+          <w:color w:val="4A4A55"/>
           <w:sz w:val="19"/>
           <w:szCs w:val="19"/>
+        </w:rPr>
+        <w:t xml:space="preserve">{contactLine}</w:t>
+      </w:r>
+    </w:p>
+    <w:p>
+      <w:pPr>
+        <w:pStyle w:val="Body"/>
+        <w:spacing w:after="240"/>
+      </w:pPr>
+      <w:r>
+        <w:rPr>
+          <w:rFonts w:ascii="Geist" w:hAnsi="Geist" w:cs="Geist"/>
           <w:color w:val="4A4A55"/>
-        </w:rPr>
-        <w:t xml:space="preserve">{contactLine}</w:t>
-      </w:r>
-    </w:p>
-    <w:p>
-      <w:pPr>
-        <w:pStyle w:val="Body"/>
-        <w:spacing w:after="240"/>
-      </w:pPr>
-      <w:r>
-        <w:rPr>
           <w:sz w:val="19"/>
           <w:szCs w:val="19"/>
-          <w:color w:val="4A4A55"/>
         </w:rPr>
         <w:t xml:space="preserve">{date}</w:t>
       </w:r>
@@ -50,7 +53,9 @@
         <w:spacing w:after="240"/>
       </w:pPr>
       <w:r>
-        <w:rPr/>
+        <w:rPr>
+          <w:rFonts w:ascii="Geist" w:hAnsi="Geist" w:cs="Geist"/>
+        </w:rPr>
         <w:t xml:space="preserve">{recipient}</w:t>
       </w:r>
     </w:p>
@@ -61,6 +66,7 @@
       </w:pPr>
       <w:r>
         <w:rPr>
+          <w:rFonts w:ascii="Geist" w:hAnsi="Geist" w:cs="Geist"/>
           <w:b/>
         </w:rPr>
         <w:t xml:space="preserve">{subject}</w:t>
@@ -72,7 +78,9 @@
         <w:spacing w:after="180"/>
       </w:pPr>
       <w:r>
-        <w:rPr/>
+        <w:rPr>
+          <w:rFonts w:ascii="Geist" w:hAnsi="Geist" w:cs="Geist"/>
+        </w:rPr>
         <w:t xml:space="preserve">{greeting}</w:t>
       </w:r>
     </w:p>
@@ -87,7 +95,9 @@
         <w:spacing w:after="180"/>
       </w:pPr>
       <w:r>
-        <w:rPr/>
+        <w:rPr>
+          <w:rFonts w:ascii="Geist" w:hAnsi="Geist" w:cs="Geist"/>
+        </w:rPr>
         <w:t xml:space="preserve">{text}</w:t>
       </w:r>
     </w:p>
@@ -102,7 +112,9 @@
         <w:spacing w:after="60"/>
       </w:pPr>
       <w:r>
-        <w:rPr/>
+        <w:rPr>
+          <w:rFonts w:ascii="Geist" w:hAnsi="Geist" w:cs="Geist"/>
+        </w:rPr>
         <w:t xml:space="preserve">{closing}</w:t>
       </w:r>
     </w:p>
@@ -112,43 +124,81 @@
         <w:spacing w:after="120"/>
       </w:pPr>
       <w:r>
-        <w:rPr/>
+        <w:rPr>
+          <w:rFonts w:ascii="Geist" w:hAnsi="Geist" w:cs="Geist"/>
+        </w:rPr>
         <w:t xml:space="preserve">{signature}</w:t>
       </w:r>
     </w:p>
     <w:sectPr>
       <w:pgSz w:w="11906" w:h="16838"/>
-      <w:pgMar w:top="1134" w:right="1134" w:bottom="1134" w:left="1134" w:header="708" w:footer="708" w:gutter="0"/>
+      <w:pgMar w:top="1134" w:right="1134" w:bottom="1134" w:left="1134" w:header="0" w:footer="708" w:gutter="0"/>
     </w:sectPr>
   </w:body>
 </w:document>
 </file>
 
+<file path=word/numbering.xml><?xml version="1.0" encoding="utf-8"?>
+<w:numbering xmlns:w="http://schemas.openxmlformats.org/wordprocessingml/2006/main">
+  <w:abstractNum w:abstractNumId="0">
+    <w:lvl w:ilvl="0">
+      <w:start w:val="1"/>
+      <w:numFmt w:val="bullet"/>
+      <w:lvlText w:val="•"/>
+      <w:lvlJc w:val="left"/>
+      <w:suff w:val="space"/>
+      <w:pPr>
+        <w:ind w:left="284" w:hanging="284"/>
+      </w:pPr>
+      <w:rPr>
+        <w:rFonts w:ascii="Geist" w:hAnsi="Geist" w:hint="default"/>
+        <w:color w:val="1277D9"/>
+      </w:rPr>
+    </w:lvl>
+  </w:abstractNum>
+  <w:num w:numId="1">
+    <w:abstractNumId w:val="0"/>
+  </w:num>
+</w:numbering>
+</file>
+
 <file path=word/styles.xml><?xml version="1.0" encoding="utf-8"?>
-<w:styles xmlns:w="http://schemas.openxmlformats.org/wordprocessingml/2006/main">
+<w:styles xmlns:w="http://schemas.openxmlformats.org/wordprocessingml/2006/main" xmlns:w14="http://schemas.microsoft.com/office/word/2010/wordml" xmlns:mc="http://schemas.openxmlformats.org/markup-compatibility/2006" mc:Ignorable="w14">
   <w:docDefaults>
     <w:rPrDefault>
       <w:rPr>
-        <w:rFonts w:ascii="Calibri" w:hAnsi="Calibri" w:cs="Calibri"/>
+        <w:rFonts w:ascii="Geist" w:hAnsi="Geist" w:cs="Geist"/>
+        <w:kern w:val="16"/>
         <w:sz w:val="21"/>
         <w:szCs w:val="21"/>
         <w:color w:val="15151C"/>
+        <w14:ligatures w14:val="standardContextual"/>
       </w:rPr>
     </w:rPrDefault>
     <w:pPrDefault>
       <w:pPr>
+        <w:widowControl/>
         <w:spacing w:line="264" w:lineRule="auto"/>
       </w:pPr>
     </w:pPrDefault>
   </w:docDefaults>
   <w:style w:type="paragraph" w:styleId="Body">
     <w:name w:val="Body"/>
+    <w:rPr>
+      <w:rFonts w:ascii="Geist" w:hAnsi="Geist" w:cs="Geist"/>
+    </w:rPr>
   </w:style>
   <w:style w:type="paragraph" w:styleId="Heading">
     <w:name w:val="Heading"/>
+    <w:rPr>
+      <w:rFonts w:ascii="Geist" w:hAnsi="Geist" w:cs="Geist"/>
+    </w:rPr>
   </w:style>
   <w:style w:type="paragraph" w:styleId="Name">
     <w:name w:val="Name"/>
+    <w:rPr>
+      <w:rFonts w:ascii="Geist" w:hAnsi="Geist" w:cs="Geist"/>
+    </w:rPr>
   </w:style>
 </w:styles>
 </file>
</xml_diff>

<commit_message>
Six document designs in both formats, and a recommendation per posting (#39)
Every CV and cover letter now downloads as .docx or PDF in any of six
designs, set in embedded Geist and gated by scripts that assert what a
parser reads out of each — in reading order for the PDFs. A rule-based
recommender picks the design per format for each posting from the ATS it
sits on, the country, the sector and the company size, and the panel's
download buttons follow it. Defaults: classic .docx for the upload,
column PDF — the dark-rail page with the photo — for a person.

Co-authored-by: Claude Opus 5 <noreply@anthropic.com>
</commit_message>
<xml_diff>
--- a/templates/cover-letter-template.docx
+++ b/templates/cover-letter-template.docx
@@ -1,6 +1,6 @@
 
 <file path=word/document.xml><?xml version="1.0" encoding="utf-8"?>
-<w:document xmlns:w="http://schemas.openxmlformats.org/wordprocessingml/2006/main">
+<w:document xmlns:w="http://schemas.openxmlformats.org/wordprocessingml/2006/main" xmlns:w14="http://schemas.microsoft.com/office/word/2010/wordml" xmlns:mc="http://schemas.openxmlformats.org/markup-compatibility/2006" xmlns:r="http://schemas.openxmlformats.org/officeDocument/2006/relationships" xmlns:wp="http://schemas.openxmlformats.org/drawingml/2006/wordprocessingDrawing" xmlns:a="http://schemas.openxmlformats.org/drawingml/2006/main" xmlns:pic="http://schemas.openxmlformats.org/drawingml/2006/picture" mc:Ignorable="w14">
   <w:body>
     <w:p>
       <w:pPr>
@@ -9,6 +9,7 @@
       </w:pPr>
       <w:r>
         <w:rPr>
+          <w:rFonts w:ascii="Geist" w:hAnsi="Geist" w:cs="Geist"/>
           <w:b/>
           <w:sz w:val="32"/>
           <w:szCs w:val="32"/>
@@ -23,23 +24,25 @@
       </w:pPr>
       <w:r>
         <w:rPr>
+          <w:rFonts w:ascii="Geist" w:hAnsi="Geist" w:cs="Geist"/>
+          <w:color w:val="4A4A55"/>
           <w:sz w:val="19"/>
           <w:szCs w:val="19"/>
+        </w:rPr>
+        <w:t xml:space="preserve">{contactLine}</w:t>
+      </w:r>
+    </w:p>
+    <w:p>
+      <w:pPr>
+        <w:pStyle w:val="Body"/>
+        <w:spacing w:after="240"/>
+      </w:pPr>
+      <w:r>
+        <w:rPr>
+          <w:rFonts w:ascii="Geist" w:hAnsi="Geist" w:cs="Geist"/>
           <w:color w:val="4A4A55"/>
-        </w:rPr>
-        <w:t xml:space="preserve">{contactLine}</w:t>
-      </w:r>
-    </w:p>
-    <w:p>
-      <w:pPr>
-        <w:pStyle w:val="Body"/>
-        <w:spacing w:after="240"/>
-      </w:pPr>
-      <w:r>
-        <w:rPr>
           <w:sz w:val="19"/>
           <w:szCs w:val="19"/>
-          <w:color w:val="4A4A55"/>
         </w:rPr>
         <w:t xml:space="preserve">{date}</w:t>
       </w:r>
@@ -50,7 +53,9 @@
         <w:spacing w:after="240"/>
       </w:pPr>
       <w:r>
-        <w:rPr/>
+        <w:rPr>
+          <w:rFonts w:ascii="Geist" w:hAnsi="Geist" w:cs="Geist"/>
+        </w:rPr>
         <w:t xml:space="preserve">{recipient}</w:t>
       </w:r>
     </w:p>
@@ -61,6 +66,7 @@
       </w:pPr>
       <w:r>
         <w:rPr>
+          <w:rFonts w:ascii="Geist" w:hAnsi="Geist" w:cs="Geist"/>
           <w:b/>
         </w:rPr>
         <w:t xml:space="preserve">{subject}</w:t>
@@ -72,7 +78,9 @@
         <w:spacing w:after="180"/>
       </w:pPr>
       <w:r>
-        <w:rPr/>
+        <w:rPr>
+          <w:rFonts w:ascii="Geist" w:hAnsi="Geist" w:cs="Geist"/>
+        </w:rPr>
         <w:t xml:space="preserve">{greeting}</w:t>
       </w:r>
     </w:p>
@@ -87,7 +95,9 @@
         <w:spacing w:after="180"/>
       </w:pPr>
       <w:r>
-        <w:rPr/>
+        <w:rPr>
+          <w:rFonts w:ascii="Geist" w:hAnsi="Geist" w:cs="Geist"/>
+        </w:rPr>
         <w:t xml:space="preserve">{text}</w:t>
       </w:r>
     </w:p>
@@ -102,7 +112,9 @@
         <w:spacing w:after="60"/>
       </w:pPr>
       <w:r>
-        <w:rPr/>
+        <w:rPr>
+          <w:rFonts w:ascii="Geist" w:hAnsi="Geist" w:cs="Geist"/>
+        </w:rPr>
         <w:t xml:space="preserve">{closing}</w:t>
       </w:r>
     </w:p>
@@ -112,43 +124,81 @@
         <w:spacing w:after="120"/>
       </w:pPr>
       <w:r>
-        <w:rPr/>
+        <w:rPr>
+          <w:rFonts w:ascii="Geist" w:hAnsi="Geist" w:cs="Geist"/>
+        </w:rPr>
         <w:t xml:space="preserve">{signature}</w:t>
       </w:r>
     </w:p>
     <w:sectPr>
       <w:pgSz w:w="11906" w:h="16838"/>
-      <w:pgMar w:top="1134" w:right="1134" w:bottom="1134" w:left="1134" w:header="708" w:footer="708" w:gutter="0"/>
+      <w:pgMar w:top="1134" w:right="1134" w:bottom="1134" w:left="1134" w:header="0" w:footer="708" w:gutter="0"/>
     </w:sectPr>
   </w:body>
 </w:document>
 </file>
 
+<file path=word/numbering.xml><?xml version="1.0" encoding="utf-8"?>
+<w:numbering xmlns:w="http://schemas.openxmlformats.org/wordprocessingml/2006/main">
+  <w:abstractNum w:abstractNumId="0">
+    <w:lvl w:ilvl="0">
+      <w:start w:val="1"/>
+      <w:numFmt w:val="bullet"/>
+      <w:lvlText w:val="•"/>
+      <w:lvlJc w:val="left"/>
+      <w:suff w:val="space"/>
+      <w:pPr>
+        <w:ind w:left="284" w:hanging="284"/>
+      </w:pPr>
+      <w:rPr>
+        <w:rFonts w:ascii="Geist" w:hAnsi="Geist" w:hint="default"/>
+        <w:color w:val="1277D9"/>
+      </w:rPr>
+    </w:lvl>
+  </w:abstractNum>
+  <w:num w:numId="1">
+    <w:abstractNumId w:val="0"/>
+  </w:num>
+</w:numbering>
+</file>
+
 <file path=word/styles.xml><?xml version="1.0" encoding="utf-8"?>
-<w:styles xmlns:w="http://schemas.openxmlformats.org/wordprocessingml/2006/main">
+<w:styles xmlns:w="http://schemas.openxmlformats.org/wordprocessingml/2006/main" xmlns:w14="http://schemas.microsoft.com/office/word/2010/wordml" xmlns:mc="http://schemas.openxmlformats.org/markup-compatibility/2006" mc:Ignorable="w14">
   <w:docDefaults>
     <w:rPrDefault>
       <w:rPr>
-        <w:rFonts w:ascii="Calibri" w:hAnsi="Calibri" w:cs="Calibri"/>
+        <w:rFonts w:ascii="Geist" w:hAnsi="Geist" w:cs="Geist"/>
+        <w:kern w:val="16"/>
         <w:sz w:val="21"/>
         <w:szCs w:val="21"/>
         <w:color w:val="15151C"/>
+        <w14:ligatures w14:val="standardContextual"/>
       </w:rPr>
     </w:rPrDefault>
     <w:pPrDefault>
       <w:pPr>
+        <w:widowControl/>
         <w:spacing w:line="264" w:lineRule="auto"/>
       </w:pPr>
     </w:pPrDefault>
   </w:docDefaults>
   <w:style w:type="paragraph" w:styleId="Body">
     <w:name w:val="Body"/>
+    <w:rPr>
+      <w:rFonts w:ascii="Geist" w:hAnsi="Geist" w:cs="Geist"/>
+    </w:rPr>
   </w:style>
   <w:style w:type="paragraph" w:styleId="Heading">
     <w:name w:val="Heading"/>
+    <w:rPr>
+      <w:rFonts w:ascii="Geist" w:hAnsi="Geist" w:cs="Geist"/>
+    </w:rPr>
   </w:style>
   <w:style w:type="paragraph" w:styleId="Name">
     <w:name w:val="Name"/>
+    <w:rPr>
+      <w:rFonts w:ascii="Geist" w:hAnsi="Geist" w:cs="Geist"/>
+    </w:rPr>
   </w:style>
 </w:styles>
 </file>
</xml_diff>